<commit_message>
Updated to two templates
</commit_message>
<xml_diff>
--- a/public/LETTER_TEMPLATE_SENTHURAN.docx
+++ b/public/LETTER_TEMPLATE_SENTHURAN.docx
@@ -1,6 +1,6 @@
 
 <file path=word/document.xml><?xml version="1.0" encoding="utf-8"?>
-<w:document xmlns:wpc="http://schemas.microsoft.com/office/word/2010/wordprocessingCanvas" xmlns:cx="http://schemas.microsoft.com/office/drawing/2014/chartex" xmlns:cx1="http://schemas.microsoft.com/office/drawing/2015/9/8/chartex" xmlns:cx2="http://schemas.microsoft.com/office/drawing/2015/10/21/chartex" xmlns:cx3="http://schemas.microsoft.com/office/drawing/2016/5/9/chartex" xmlns:cx4="http://schemas.microsoft.com/office/drawing/2016/5/10/chartex" xmlns:cx5="http://schemas.microsoft.com/office/drawing/2016/5/11/chartex" xmlns:cx6="http://schemas.microsoft.com/office/drawing/2016/5/12/chartex" xmlns:cx7="http://schemas.microsoft.com/office/drawing/2016/5/13/chartex" xmlns:cx8="http://schemas.microsoft.com/office/drawing/2016/5/14/chartex" xmlns:mc="http://schemas.openxmlformats.org/markup-compatibility/2006" xmlns:aink="http://schemas.microsoft.com/office/drawing/2016/ink" xmlns:am3d="http://schemas.microsoft.com/office/drawing/2017/model3d" xmlns:o="urn:schemas-microsoft-com:office:office" xmlns:oel="http://schemas.microsoft.com/office/2019/extlst" xmlns:r="http://schemas.openxmlformats.org/officeDocument/2006/relationships" xmlns:m="http://schemas.openxmlformats.org/officeDocument/2006/math" xmlns:v="urn:schemas-microsoft-com:vml" xmlns:wp14="http://schemas.microsoft.com/office/word/2010/wordprocessingDrawing" xmlns:wp="http://schemas.openxmlformats.org/drawingml/2006/wordprocessingDrawing" xmlns:w10="urn:schemas-microsoft-com:office:word" xmlns:w="http://schemas.openxmlformats.org/wordprocessingml/2006/main" xmlns:w14="http://schemas.microsoft.com/office/word/2010/wordml" xmlns:w15="http://schemas.microsoft.com/office/word/2012/wordml" xmlns:w16cex="http://schemas.microsoft.com/office/word/2018/wordml/cex" xmlns:w16cid="http://schemas.microsoft.com/office/word/2016/wordml/cid" xmlns:w16="http://schemas.microsoft.com/office/word/2018/wordml" xmlns:w16du="http://schemas.microsoft.com/office/word/2023/wordml/word16du" xmlns:w16sdtdh="http://schemas.microsoft.com/office/word/2020/wordml/sdtdatahash" xmlns:w16sdtfl="http://schemas.microsoft.com/office/word/2024/wordml/sdtformatlock" xmlns:w16se="http://schemas.microsoft.com/office/word/2015/wordml/symex" xmlns:wpg="http://schemas.microsoft.com/office/word/2010/wordprocessingGroup" xmlns:wpi="http://schemas.microsoft.com/office/word/2010/wordprocessingInk" xmlns:wne="http://schemas.microsoft.com/office/word/2006/wordml" xmlns:wps="http://schemas.microsoft.com/office/word/2010/wordprocessingShape" mc:Ignorable="w14 w15 w16se w16cid w16 w16cex w16sdtdh w16sdtfl w16du wp14">
+<w:document xmlns:wpc="http://schemas.microsoft.com/office/word/2010/wordprocessingCanvas" xmlns:cx="http://schemas.microsoft.com/office/drawing/2014/chartex" xmlns:cx1="http://schemas.microsoft.com/office/drawing/2015/9/8/chartex" xmlns:cx2="http://schemas.microsoft.com/office/drawing/2015/10/21/chartex" xmlns:cx3="http://schemas.microsoft.com/office/drawing/2016/5/9/chartex" xmlns:cx4="http://schemas.microsoft.com/office/drawing/2016/5/10/chartex" xmlns:cx5="http://schemas.microsoft.com/office/drawing/2016/5/11/chartex" xmlns:cx6="http://schemas.microsoft.com/office/drawing/2016/5/12/chartex" xmlns:cx7="http://schemas.microsoft.com/office/drawing/2016/5/13/chartex" xmlns:cx8="http://schemas.microsoft.com/office/drawing/2016/5/14/chartex" xmlns:mc="http://schemas.openxmlformats.org/markup-compatibility/2006" xmlns:aink="http://schemas.microsoft.com/office/drawing/2016/ink" xmlns:am3d="http://schemas.microsoft.com/office/drawing/2017/model3d" xmlns:o="urn:schemas-microsoft-com:office:office" xmlns:r="http://schemas.openxmlformats.org/officeDocument/2006/relationships" xmlns:m="http://schemas.openxmlformats.org/officeDocument/2006/math" xmlns:v="urn:schemas-microsoft-com:vml" xmlns:wp14="http://schemas.microsoft.com/office/word/2010/wordprocessingDrawing" xmlns:wp="http://schemas.openxmlformats.org/drawingml/2006/wordprocessingDrawing" xmlns:w10="urn:schemas-microsoft-com:office:word" xmlns:w="http://schemas.openxmlformats.org/wordprocessingml/2006/main" xmlns:w14="http://schemas.microsoft.com/office/word/2010/wordml" xmlns:w15="http://schemas.microsoft.com/office/word/2012/wordml" xmlns:w16cex="http://schemas.microsoft.com/office/word/2018/wordml/cex" xmlns:w16cid="http://schemas.microsoft.com/office/word/2016/wordml/cid" xmlns:w16="http://schemas.microsoft.com/office/word/2018/wordml" xmlns:w16sdtdh="http://schemas.microsoft.com/office/word/2020/wordml/sdtdatahash" xmlns:w16se="http://schemas.microsoft.com/office/word/2015/wordml/symex" xmlns:wpg="http://schemas.microsoft.com/office/word/2010/wordprocessingGroup" xmlns:wpi="http://schemas.microsoft.com/office/word/2010/wordprocessingInk" xmlns:wne="http://schemas.microsoft.com/office/word/2006/wordml" xmlns:wps="http://schemas.microsoft.com/office/word/2010/wordprocessingShape" mc:Ignorable="w14 w15 w16se w16cid w16 w16cex w16sdtdh wp14">
   <w:body>
     <w:p>
       <w:pPr>
@@ -150,15 +150,13 @@
           <w:rFonts w:asciiTheme="minorHAnsi" w:hAnsiTheme="minorHAnsi" w:cs="Calibri"/>
           <w:sz w:val="21"/>
           <w:szCs w:val="21"/>
-          <w:lang w:val="en-US"/>
-        </w:rPr>
-      </w:pPr>
-      <w:r>
-        <w:rPr>
-          <w:rFonts w:asciiTheme="minorHAnsi" w:hAnsiTheme="minorHAnsi" w:cs="Calibri"/>
-          <w:sz w:val="21"/>
-          <w:szCs w:val="21"/>
-          <w:lang w:val="en-US"/>
+        </w:rPr>
+      </w:pPr>
+      <w:r>
+        <w:rPr>
+          <w:rFonts w:asciiTheme="minorHAnsi" w:hAnsiTheme="minorHAnsi" w:cs="Calibri"/>
+          <w:sz w:val="21"/>
+          <w:szCs w:val="21"/>
         </w:rPr>
         <w:t>{date}</w:t>
       </w:r>
@@ -184,25 +182,27 @@
     <w:p>
       <w:pPr>
         <w:tabs>
-          <w:tab w:val="left" w:pos="567"/>
-        </w:tabs>
-        <w:spacing w:line="240" w:lineRule="auto"/>
-        <w:contextualSpacing/>
-        <w:rPr>
-          <w:rFonts w:asciiTheme="minorHAnsi" w:hAnsiTheme="minorHAnsi" w:cs="Calibri"/>
-          <w:sz w:val="21"/>
-          <w:szCs w:val="21"/>
-          <w:lang w:val="en-US"/>
-        </w:rPr>
-      </w:pPr>
-      <w:r>
-        <w:rPr>
-          <w:rFonts w:asciiTheme="minorHAnsi" w:hAnsiTheme="minorHAnsi" w:cs="Calibri"/>
-          <w:sz w:val="21"/>
-          <w:szCs w:val="21"/>
-          <w:lang w:val="en-US"/>
-        </w:rPr>
-        <w:t>{</w:t>
+          <w:tab w:val="left" w:pos="284"/>
+          <w:tab w:val="left" w:pos="567"/>
+          <w:tab w:val="left" w:pos="851"/>
+          <w:tab w:val="left" w:pos="1134"/>
+          <w:tab w:val="left" w:pos="1701"/>
+        </w:tabs>
+        <w:spacing w:line="240" w:lineRule="auto"/>
+        <w:contextualSpacing/>
+        <w:rPr>
+          <w:rFonts w:asciiTheme="minorHAnsi" w:hAnsiTheme="minorHAnsi" w:cs="Calibri"/>
+          <w:sz w:val="21"/>
+          <w:szCs w:val="21"/>
+        </w:rPr>
+      </w:pPr>
+      <w:r>
+        <w:rPr>
+          <w:rFonts w:asciiTheme="minorHAnsi" w:hAnsiTheme="minorHAnsi" w:cs="Calibri"/>
+          <w:sz w:val="21"/>
+          <w:szCs w:val="21"/>
+        </w:rPr>
+        <w:t xml:space="preserve">{referringDoctorName}</w:t>
       </w:r>
       <w:proofErr w:type="spellStart"/>
       <w:r>
@@ -210,20 +210,10 @@
           <w:rFonts w:asciiTheme="minorHAnsi" w:hAnsiTheme="minorHAnsi" w:cs="Calibri"/>
           <w:sz w:val="21"/>
           <w:szCs w:val="21"/>
-          <w:lang w:val="en-US"/>
-        </w:rPr>
-        <w:t>referringDoctorName</w:t>
+        </w:rPr>
+        <w:t/>
       </w:r>
       <w:proofErr w:type="spellEnd"/>
-      <w:r>
-        <w:rPr>
-          <w:rFonts w:asciiTheme="minorHAnsi" w:hAnsiTheme="minorHAnsi" w:cs="Calibri"/>
-          <w:sz w:val="21"/>
-          <w:szCs w:val="21"/>
-          <w:lang w:val="en-US"/>
-        </w:rPr>
-        <w:t>}</w:t>
-      </w:r>
     </w:p>
     <w:p>
       <w:pPr>
@@ -236,7 +226,6 @@
           <w:rFonts w:asciiTheme="minorHAnsi" w:hAnsiTheme="minorHAnsi" w:cstheme="minorHAnsi"/>
           <w:sz w:val="21"/>
           <w:szCs w:val="21"/>
-          <w:lang w:val="en-US"/>
         </w:rPr>
       </w:pPr>
       <w:r>
@@ -244,113 +233,95 @@
           <w:rFonts w:asciiTheme="minorHAnsi" w:hAnsiTheme="minorHAnsi" w:cstheme="minorHAnsi"/>
           <w:sz w:val="21"/>
           <w:szCs w:val="21"/>
-          <w:lang w:val="en-US"/>
-        </w:rPr>
-        <w:t>{</w:t>
-      </w:r>
-      <w:proofErr w:type="spellStart"/>
-      <w:r>
+        </w:rPr>
+        <w:t>{referringDoctorClinic}</w:t>
+      </w:r>
+    </w:p>
+    <w:p>
+      <w:pPr>
+        <w:tabs>
+          <w:tab w:val="left" w:pos="567"/>
+        </w:tabs>
+        <w:spacing w:line="240" w:lineRule="auto"/>
+        <w:contextualSpacing/>
         <w:rPr>
           <w:rFonts w:asciiTheme="minorHAnsi" w:hAnsiTheme="minorHAnsi" w:cstheme="minorHAnsi"/>
           <w:sz w:val="21"/>
           <w:szCs w:val="21"/>
-          <w:lang w:val="en-US"/>
-        </w:rPr>
-        <w:t>referringDoctorClinic</w:t>
-      </w:r>
-      <w:proofErr w:type="spellEnd"/>
+        </w:rPr>
+      </w:pPr>
       <w:r>
         <w:rPr>
           <w:rFonts w:asciiTheme="minorHAnsi" w:hAnsiTheme="minorHAnsi" w:cstheme="minorHAnsi"/>
           <w:sz w:val="21"/>
           <w:szCs w:val="21"/>
-          <w:lang w:val="en-US"/>
-        </w:rPr>
-        <w:t>}</w:t>
-      </w:r>
-    </w:p>
-    <w:p>
-      <w:pPr>
-        <w:tabs>
-          <w:tab w:val="left" w:pos="284"/>
-          <w:tab w:val="left" w:pos="567"/>
-          <w:tab w:val="left" w:pos="851"/>
-          <w:tab w:val="left" w:pos="1134"/>
-          <w:tab w:val="left" w:pos="1701"/>
-        </w:tabs>
-        <w:spacing w:line="240" w:lineRule="auto"/>
-        <w:contextualSpacing/>
+        </w:rPr>
+        <w:t xml:space="preserve">{referringDoctorAddress}</w:t>
+      </w:r>
+      <w:r>
         <w:rPr>
           <w:rFonts w:asciiTheme="minorHAnsi" w:hAnsiTheme="minorHAnsi" w:cstheme="minorHAnsi"/>
           <w:sz w:val="21"/>
           <w:szCs w:val="21"/>
-          <w:lang w:val="en-US"/>
-        </w:rPr>
-      </w:pPr>
-      <w:r>
+        </w:rPr>
+        <w:t/>
+      </w:r>
+    </w:p>
+    <w:p>
+      <w:pPr>
+        <w:tabs>
+          <w:tab w:val="left" w:pos="567"/>
+        </w:tabs>
+        <w:spacing w:line="240" w:lineRule="auto"/>
+        <w:contextualSpacing/>
         <w:rPr>
           <w:rFonts w:asciiTheme="minorHAnsi" w:hAnsiTheme="minorHAnsi" w:cstheme="minorHAnsi"/>
           <w:sz w:val="21"/>
           <w:szCs w:val="21"/>
-          <w:lang w:val="en-US"/>
-        </w:rPr>
-        <w:t>{</w:t>
-      </w:r>
-      <w:proofErr w:type="spellStart"/>
+        </w:rPr>
+      </w:pPr>
       <w:r>
         <w:rPr>
           <w:rFonts w:asciiTheme="minorHAnsi" w:hAnsiTheme="minorHAnsi" w:cstheme="minorHAnsi"/>
           <w:sz w:val="21"/>
           <w:szCs w:val="21"/>
-          <w:lang w:val="en-US"/>
-        </w:rPr>
-        <w:t>referringDoctorAddress</w:t>
-      </w:r>
-      <w:proofErr w:type="spellEnd"/>
-      <w:r>
-        <w:rPr>
-          <w:rFonts w:asciiTheme="minorHAnsi" w:hAnsiTheme="minorHAnsi" w:cstheme="minorHAnsi"/>
-          <w:sz w:val="21"/>
-          <w:szCs w:val="21"/>
-          <w:lang w:val="en-US"/>
-        </w:rPr>
-        <w:t>}</w:t>
-      </w:r>
-    </w:p>
-    <w:p>
-      <w:pPr>
-        <w:tabs>
-          <w:tab w:val="left" w:pos="284"/>
-          <w:tab w:val="left" w:pos="567"/>
-          <w:tab w:val="left" w:pos="851"/>
-          <w:tab w:val="left" w:pos="1134"/>
-          <w:tab w:val="left" w:pos="1701"/>
-        </w:tabs>
-        <w:spacing w:line="240" w:lineRule="auto"/>
-        <w:contextualSpacing/>
-        <w:rPr>
-          <w:rFonts w:asciiTheme="minorHAnsi" w:hAnsiTheme="minorHAnsi" w:cs="Calibri"/>
-          <w:sz w:val="21"/>
-          <w:szCs w:val="21"/>
-        </w:rPr>
-      </w:pPr>
-    </w:p>
-    <w:p>
-      <w:pPr>
-        <w:tabs>
-          <w:tab w:val="left" w:pos="284"/>
-          <w:tab w:val="left" w:pos="567"/>
-          <w:tab w:val="left" w:pos="851"/>
-          <w:tab w:val="left" w:pos="1134"/>
-          <w:tab w:val="left" w:pos="1701"/>
-        </w:tabs>
-        <w:spacing w:line="240" w:lineRule="auto"/>
-        <w:contextualSpacing/>
-        <w:rPr>
-          <w:rFonts w:asciiTheme="minorHAnsi" w:hAnsiTheme="minorHAnsi" w:cs="Calibri"/>
-          <w:sz w:val="21"/>
-          <w:szCs w:val="21"/>
-          <w:lang w:val="en-US"/>
+        </w:rPr>
+        <w:t/>
+      </w:r>
+    </w:p>
+    <w:p>
+      <w:pPr>
+        <w:tabs>
+          <w:tab w:val="left" w:pos="284"/>
+          <w:tab w:val="left" w:pos="567"/>
+          <w:tab w:val="left" w:pos="851"/>
+          <w:tab w:val="left" w:pos="1134"/>
+          <w:tab w:val="left" w:pos="1701"/>
+        </w:tabs>
+        <w:spacing w:line="240" w:lineRule="auto"/>
+        <w:contextualSpacing/>
+        <w:rPr>
+          <w:rFonts w:asciiTheme="minorHAnsi" w:hAnsiTheme="minorHAnsi" w:cs="Calibri"/>
+          <w:sz w:val="21"/>
+          <w:szCs w:val="21"/>
+        </w:rPr>
+      </w:pPr>
+    </w:p>
+    <w:p>
+      <w:pPr>
+        <w:tabs>
+          <w:tab w:val="left" w:pos="284"/>
+          <w:tab w:val="left" w:pos="567"/>
+          <w:tab w:val="left" w:pos="851"/>
+          <w:tab w:val="left" w:pos="1134"/>
+          <w:tab w:val="left" w:pos="1701"/>
+        </w:tabs>
+        <w:spacing w:line="240" w:lineRule="auto"/>
+        <w:contextualSpacing/>
+        <w:rPr>
+          <w:rFonts w:asciiTheme="minorHAnsi" w:hAnsiTheme="minorHAnsi" w:cs="Calibri"/>
+          <w:sz w:val="21"/>
+          <w:szCs w:val="21"/>
         </w:rPr>
       </w:pPr>
       <w:r>
@@ -366,7 +337,6 @@
           <w:rFonts w:asciiTheme="minorHAnsi" w:hAnsiTheme="minorHAnsi" w:cs="Calibri"/>
           <w:sz w:val="21"/>
           <w:szCs w:val="21"/>
-          <w:lang w:val="en-US"/>
         </w:rPr>
         <w:t>{salutation}</w:t>
       </w:r>
@@ -413,7 +383,6 @@
           <w:b/>
           <w:sz w:val="21"/>
           <w:szCs w:val="21"/>
-          <w:lang w:val="en-US"/>
         </w:rPr>
       </w:pPr>
       <w:r>
@@ -439,7 +408,7 @@
           <w:sz w:val="21"/>
           <w:szCs w:val="21"/>
         </w:rPr>
-        <w:t>RE</w:t>
+        <w:t xml:space="preserve">RE:  </w:t>
       </w:r>
       <w:r>
         <w:rPr>
@@ -448,29 +417,55 @@
           <w:sz w:val="21"/>
           <w:szCs w:val="21"/>
         </w:rPr>
-        <w:t>: {</w:t>
-      </w:r>
-      <w:proofErr w:type="spellStart"/>
-      <w:r>
+        <w:t>{patientName}</w:t>
+      </w:r>
+    </w:p>
+    <w:p>
+      <w:pPr>
+        <w:tabs>
+          <w:tab w:val="left" w:pos="284"/>
+          <w:tab w:val="left" w:pos="567"/>
+          <w:tab w:val="left" w:pos="851"/>
+          <w:tab w:val="left" w:pos="1134"/>
+          <w:tab w:val="left" w:pos="1701"/>
+        </w:tabs>
+        <w:spacing w:line="240" w:lineRule="auto"/>
+        <w:contextualSpacing/>
+        <w:outlineLvl w:val="0"/>
         <w:rPr>
           <w:rFonts w:asciiTheme="minorHAnsi" w:hAnsiTheme="minorHAnsi" w:cs="Calibri"/>
           <w:b/>
           <w:sz w:val="21"/>
           <w:szCs w:val="21"/>
-          <w:lang w:val="en-US"/>
-        </w:rPr>
-        <w:t>patientName</w:t>
-      </w:r>
-      <w:proofErr w:type="spellEnd"/>
+        </w:rPr>
+      </w:pPr>
       <w:r>
         <w:rPr>
           <w:rFonts w:asciiTheme="minorHAnsi" w:hAnsiTheme="minorHAnsi" w:cs="Calibri"/>
           <w:b/>
           <w:sz w:val="21"/>
           <w:szCs w:val="21"/>
-          <w:lang w:val="en-US"/>
-        </w:rPr>
-        <w:t>}</w:t>
+        </w:rPr>
+        <w:tab/>
+      </w:r>
+      <w:r>
+        <w:rPr>
+          <w:rFonts w:asciiTheme="minorHAnsi" w:hAnsiTheme="minorHAnsi" w:cs="Calibri"/>
+          <w:b/>
+          <w:sz w:val="21"/>
+          <w:szCs w:val="21"/>
+        </w:rPr>
+        <w:tab/>
+        <w:t xml:space="preserve">DOB:  </w:t>
+      </w:r>
+      <w:r>
+        <w:rPr>
+          <w:rFonts w:asciiTheme="minorHAnsi" w:hAnsiTheme="minorHAnsi" w:cs="Calibri"/>
+          <w:b/>
+          <w:sz w:val="21"/>
+          <w:szCs w:val="21"/>
+        </w:rPr>
+        <w:t>{patientDOB}</w:t>
       </w:r>
     </w:p>
     <w:p>
@@ -490,7 +485,6 @@
           <w:b/>
           <w:sz w:val="21"/>
           <w:szCs w:val="21"/>
-          <w:lang w:val="en-US"/>
         </w:rPr>
       </w:pPr>
       <w:r>
@@ -510,7 +504,6 @@
           <w:szCs w:val="21"/>
         </w:rPr>
         <w:tab/>
-        <w:t>DOB</w:t>
       </w:r>
       <w:r>
         <w:rPr>
@@ -519,172 +512,45 @@
           <w:sz w:val="21"/>
           <w:szCs w:val="21"/>
         </w:rPr>
-        <w:t>: {</w:t>
-      </w:r>
-      <w:proofErr w:type="spellStart"/>
+        <w:t>{patientAddress}</w:t>
+      </w:r>
+    </w:p>
+    <w:p>
+      <w:pPr>
+        <w:tabs>
+          <w:tab w:val="left" w:pos="284"/>
+          <w:tab w:val="left" w:pos="567"/>
+          <w:tab w:val="left" w:pos="851"/>
+          <w:tab w:val="left" w:pos="1134"/>
+          <w:tab w:val="left" w:pos="1701"/>
+        </w:tabs>
+        <w:spacing w:line="240" w:lineRule="auto"/>
+        <w:contextualSpacing/>
+        <w:outlineLvl w:val="0"/>
+        <w:rPr>
+          <w:rFonts w:asciiTheme="minorHAnsi" w:hAnsiTheme="minorHAnsi" w:cs="Calibri"/>
+          <w:sz w:val="21"/>
+          <w:szCs w:val="21"/>
+        </w:rPr>
+      </w:pPr>
       <w:r>
         <w:rPr>
           <w:rFonts w:asciiTheme="minorHAnsi" w:hAnsiTheme="minorHAnsi" w:cs="Calibri"/>
           <w:b/>
           <w:sz w:val="21"/>
           <w:szCs w:val="21"/>
-          <w:lang w:val="en-US"/>
-        </w:rPr>
-        <w:t>patientDOB</w:t>
-      </w:r>
-      <w:proofErr w:type="spellEnd"/>
+        </w:rPr>
+        <w:tab/>
+      </w:r>
       <w:r>
         <w:rPr>
           <w:rFonts w:asciiTheme="minorHAnsi" w:hAnsiTheme="minorHAnsi" w:cs="Calibri"/>
           <w:b/>
           <w:sz w:val="21"/>
           <w:szCs w:val="21"/>
-          <w:lang w:val="en-US"/>
-        </w:rPr>
-        <w:t>}</w:t>
-      </w:r>
-    </w:p>
-    <w:p>
-      <w:pPr>
-        <w:tabs>
-          <w:tab w:val="left" w:pos="284"/>
-          <w:tab w:val="left" w:pos="567"/>
-          <w:tab w:val="left" w:pos="851"/>
-          <w:tab w:val="left" w:pos="1134"/>
-          <w:tab w:val="left" w:pos="1701"/>
-        </w:tabs>
-        <w:spacing w:line="240" w:lineRule="auto"/>
-        <w:contextualSpacing/>
-        <w:outlineLvl w:val="0"/>
-        <w:rPr>
-          <w:rFonts w:asciiTheme="minorHAnsi" w:hAnsiTheme="minorHAnsi" w:cs="Calibri"/>
-          <w:b/>
-          <w:sz w:val="21"/>
-          <w:szCs w:val="21"/>
-          <w:lang w:val="en-US"/>
-        </w:rPr>
-      </w:pPr>
-      <w:r>
-        <w:rPr>
-          <w:rFonts w:asciiTheme="minorHAnsi" w:hAnsiTheme="minorHAnsi" w:cs="Calibri"/>
-          <w:b/>
-          <w:sz w:val="21"/>
-          <w:szCs w:val="21"/>
         </w:rPr>
         <w:tab/>
-      </w:r>
-      <w:r>
-        <w:rPr>
-          <w:rFonts w:asciiTheme="minorHAnsi" w:hAnsiTheme="minorHAnsi" w:cs="Calibri"/>
-          <w:b/>
-          <w:sz w:val="21"/>
-          <w:szCs w:val="21"/>
-        </w:rPr>
-        <w:tab/>
-      </w:r>
-      <w:r>
-        <w:rPr>
-          <w:rFonts w:asciiTheme="minorHAnsi" w:hAnsiTheme="minorHAnsi" w:cs="Calibri"/>
-          <w:b/>
-          <w:sz w:val="21"/>
-          <w:szCs w:val="21"/>
-          <w:lang w:val="en-US"/>
-        </w:rPr>
-        <w:t>{</w:t>
-      </w:r>
-      <w:proofErr w:type="spellStart"/>
-      <w:r>
-        <w:rPr>
-          <w:rFonts w:asciiTheme="minorHAnsi" w:hAnsiTheme="minorHAnsi" w:cs="Calibri"/>
-          <w:b/>
-          <w:sz w:val="21"/>
-          <w:szCs w:val="21"/>
-          <w:lang w:val="en-US"/>
-        </w:rPr>
-        <w:t>patientAddress</w:t>
-      </w:r>
-      <w:proofErr w:type="spellEnd"/>
-      <w:r>
-        <w:rPr>
-          <w:rFonts w:asciiTheme="minorHAnsi" w:hAnsiTheme="minorHAnsi" w:cs="Calibri"/>
-          <w:b/>
-          <w:sz w:val="21"/>
-          <w:szCs w:val="21"/>
-          <w:lang w:val="en-US"/>
-        </w:rPr>
-        <w:t>}</w:t>
-      </w:r>
-    </w:p>
-    <w:p>
-      <w:pPr>
-        <w:tabs>
-          <w:tab w:val="left" w:pos="284"/>
-          <w:tab w:val="left" w:pos="567"/>
-          <w:tab w:val="left" w:pos="851"/>
-          <w:tab w:val="left" w:pos="1134"/>
-          <w:tab w:val="left" w:pos="1701"/>
-        </w:tabs>
-        <w:spacing w:line="240" w:lineRule="auto"/>
-        <w:contextualSpacing/>
-        <w:outlineLvl w:val="0"/>
-        <w:rPr>
-          <w:rFonts w:asciiTheme="minorHAnsi" w:hAnsiTheme="minorHAnsi" w:cs="Calibri"/>
-          <w:b/>
-          <w:sz w:val="21"/>
-          <w:szCs w:val="21"/>
-          <w:lang w:val="en-US"/>
-        </w:rPr>
-      </w:pPr>
-      <w:r>
-        <w:rPr>
-          <w:rFonts w:asciiTheme="minorHAnsi" w:hAnsiTheme="minorHAnsi" w:cs="Calibri"/>
-          <w:b/>
-          <w:sz w:val="21"/>
-          <w:szCs w:val="21"/>
-        </w:rPr>
-        <w:tab/>
-      </w:r>
-      <w:r>
-        <w:rPr>
-          <w:rFonts w:asciiTheme="minorHAnsi" w:hAnsiTheme="minorHAnsi" w:cs="Calibri"/>
-          <w:b/>
-          <w:sz w:val="21"/>
-          <w:szCs w:val="21"/>
-        </w:rPr>
-        <w:tab/>
-        <w:t xml:space="preserve">Ph: </w:t>
-      </w:r>
-      <w:r>
-        <w:rPr>
-          <w:rFonts w:asciiTheme="minorHAnsi" w:hAnsiTheme="minorHAnsi" w:cs="Calibri"/>
-          <w:b/>
-          <w:sz w:val="21"/>
-          <w:szCs w:val="21"/>
-          <w:lang w:val="en-US"/>
-        </w:rPr>
-        <w:t>{</w:t>
-      </w:r>
-      <w:proofErr w:type="spellStart"/>
-      <w:r>
-        <w:rPr>
-          <w:rFonts w:asciiTheme="minorHAnsi" w:hAnsiTheme="minorHAnsi" w:cs="Calibri"/>
-          <w:b/>
-          <w:sz w:val="21"/>
-          <w:szCs w:val="21"/>
-          <w:lang w:val="en-US"/>
-        </w:rPr>
-        <w:t>patientContact</w:t>
-      </w:r>
-      <w:proofErr w:type="spellEnd"/>
-      <w:r>
-        <w:rPr>
-          <w:rFonts w:asciiTheme="minorHAnsi" w:hAnsiTheme="minorHAnsi" w:cs="Calibri"/>
-          <w:b/>
-          <w:sz w:val="21"/>
-          <w:szCs w:val="21"/>
-          <w:lang w:val="en-US"/>
-        </w:rPr>
-        <w:t>}</w:t>
+        <w:t>Ph: {patientContact}</w:t>
       </w:r>
     </w:p>
     <w:p>
@@ -722,17 +588,213 @@
           <w:rFonts w:asciiTheme="minorHAnsi" w:hAnsiTheme="minorHAnsi" w:cs="Calibri"/>
           <w:sz w:val="21"/>
           <w:szCs w:val="21"/>
-          <w:lang w:val="en-US"/>
-        </w:rPr>
-      </w:pPr>
-      <w:r>
-        <w:rPr>
-          <w:rFonts w:asciiTheme="minorHAnsi" w:hAnsiTheme="minorHAnsi" w:cs="Calibri"/>
-          <w:sz w:val="21"/>
-          <w:szCs w:val="21"/>
-          <w:lang w:val="en-US"/>
-        </w:rPr>
-        <w:t>{body}</w:t>
+        </w:rPr>
+      </w:pPr>
+      <w:r>
+        <w:rPr>
+          <w:rFonts w:asciiTheme="minorHAnsi" w:hAnsiTheme="minorHAnsi" w:cs="Calibri"/>
+          <w:sz w:val="21"/>
+          <w:szCs w:val="21"/>
+        </w:rPr>
+        <w:t xml:space="preserve">{body}</w:t>
+      </w:r>
+      <w:proofErr w:type="gramStart"/>
+      <w:r>
+        <w:rPr>
+          <w:rFonts w:asciiTheme="minorHAnsi" w:hAnsiTheme="minorHAnsi" w:cs="Calibri"/>
+          <w:sz w:val="21"/>
+          <w:szCs w:val="21"/>
+        </w:rPr>
+        <w:t/>
+      </w:r>
+      <w:proofErr w:type="gramEnd"/>
+      <w:r>
+        <w:rPr>
+          <w:rFonts w:asciiTheme="minorHAnsi" w:hAnsiTheme="minorHAnsi" w:cs="Calibri"/>
+          <w:sz w:val="21"/>
+          <w:szCs w:val="21"/>
+        </w:rPr>
+        <w:t xml:space="preserve"/>
+      </w:r>
+      <w:proofErr w:type="gramStart"/>
+      <w:r>
+        <w:rPr>
+          <w:rFonts w:asciiTheme="minorHAnsi" w:hAnsiTheme="minorHAnsi" w:cs="Calibri"/>
+          <w:sz w:val="21"/>
+          <w:szCs w:val="21"/>
+        </w:rPr>
+        <w:t/>
+      </w:r>
+      <w:proofErr w:type="gramEnd"/>
+      <w:r>
+        <w:rPr>
+          <w:rFonts w:asciiTheme="minorHAnsi" w:hAnsiTheme="minorHAnsi" w:cs="Calibri"/>
+          <w:sz w:val="21"/>
+          <w:szCs w:val="21"/>
+        </w:rPr>
+        <w:t/>
+      </w:r>
+    </w:p>
+    <w:p>
+      <w:pPr>
+        <w:tabs>
+          <w:tab w:val="left" w:pos="284"/>
+          <w:tab w:val="left" w:pos="567"/>
+          <w:tab w:val="left" w:pos="851"/>
+          <w:tab w:val="left" w:pos="1134"/>
+          <w:tab w:val="left" w:pos="1701"/>
+        </w:tabs>
+        <w:spacing w:line="240" w:lineRule="auto"/>
+        <w:contextualSpacing/>
+        <w:jc w:val="both"/>
+        <w:rPr>
+          <w:rFonts w:asciiTheme="minorHAnsi" w:hAnsiTheme="minorHAnsi" w:cs="Calibri"/>
+          <w:sz w:val="21"/>
+          <w:szCs w:val="21"/>
+        </w:rPr>
+      </w:pPr>
+    </w:p>
+    <w:p>
+      <w:pPr>
+        <w:tabs>
+          <w:tab w:val="left" w:pos="284"/>
+          <w:tab w:val="left" w:pos="567"/>
+          <w:tab w:val="left" w:pos="851"/>
+          <w:tab w:val="left" w:pos="1134"/>
+          <w:tab w:val="left" w:pos="1701"/>
+        </w:tabs>
+        <w:spacing w:line="240" w:lineRule="auto"/>
+        <w:contextualSpacing/>
+        <w:jc w:val="both"/>
+        <w:rPr>
+          <w:rFonts w:asciiTheme="minorHAnsi" w:hAnsiTheme="minorHAnsi" w:cs="Calibri"/>
+          <w:sz w:val="21"/>
+          <w:szCs w:val="21"/>
+        </w:rPr>
+      </w:pPr>
+      <w:r>
+        <w:rPr>
+          <w:rFonts w:asciiTheme="minorHAnsi" w:hAnsiTheme="minorHAnsi" w:cs="Calibri"/>
+          <w:sz w:val="21"/>
+          <w:szCs w:val="21"/>
+        </w:rPr>
+        <w:t/>
+      </w:r>
+      <w:r>
+        <w:rPr>
+          <w:rFonts w:asciiTheme="minorHAnsi" w:hAnsiTheme="minorHAnsi" w:cs="Calibri"/>
+          <w:sz w:val="21"/>
+          <w:szCs w:val="21"/>
+        </w:rPr>
+        <w:t/>
+      </w:r>
+      <w:r>
+        <w:rPr>
+          <w:rFonts w:asciiTheme="minorHAnsi" w:hAnsiTheme="minorHAnsi" w:cs="Calibri"/>
+          <w:sz w:val="21"/>
+          <w:szCs w:val="21"/>
+        </w:rPr>
+        <w:t xml:space="preserve"/>
+      </w:r>
+    </w:p>
+    <w:p>
+      <w:pPr>
+        <w:tabs>
+          <w:tab w:val="left" w:pos="284"/>
+          <w:tab w:val="left" w:pos="567"/>
+          <w:tab w:val="left" w:pos="851"/>
+          <w:tab w:val="left" w:pos="1134"/>
+          <w:tab w:val="left" w:pos="1701"/>
+        </w:tabs>
+        <w:spacing w:line="240" w:lineRule="auto"/>
+        <w:contextualSpacing/>
+        <w:jc w:val="both"/>
+        <w:rPr>
+          <w:rFonts w:asciiTheme="minorHAnsi" w:hAnsiTheme="minorHAnsi" w:cs="Calibri"/>
+          <w:sz w:val="21"/>
+          <w:szCs w:val="21"/>
+        </w:rPr>
+      </w:pPr>
+    </w:p>
+    <w:p>
+      <w:pPr>
+        <w:tabs>
+          <w:tab w:val="left" w:pos="284"/>
+          <w:tab w:val="left" w:pos="567"/>
+          <w:tab w:val="left" w:pos="851"/>
+          <w:tab w:val="left" w:pos="1134"/>
+          <w:tab w:val="left" w:pos="1701"/>
+        </w:tabs>
+        <w:spacing w:line="240" w:lineRule="auto"/>
+        <w:contextualSpacing/>
+        <w:jc w:val="both"/>
+        <w:rPr>
+          <w:rFonts w:asciiTheme="minorHAnsi" w:hAnsiTheme="minorHAnsi" w:cs="Calibri"/>
+          <w:sz w:val="21"/>
+          <w:szCs w:val="21"/>
+        </w:rPr>
+      </w:pPr>
+      <w:r>
+        <w:rPr>
+          <w:rFonts w:asciiTheme="minorHAnsi" w:hAnsiTheme="minorHAnsi" w:cs="Calibri"/>
+          <w:sz w:val="21"/>
+          <w:szCs w:val="21"/>
+        </w:rPr>
+        <w:t/>
+      </w:r>
+    </w:p>
+    <w:p>
+      <w:pPr>
+        <w:tabs>
+          <w:tab w:val="left" w:pos="284"/>
+          <w:tab w:val="left" w:pos="567"/>
+          <w:tab w:val="left" w:pos="851"/>
+          <w:tab w:val="left" w:pos="1134"/>
+          <w:tab w:val="left" w:pos="1701"/>
+        </w:tabs>
+        <w:spacing w:line="240" w:lineRule="auto"/>
+        <w:contextualSpacing/>
+        <w:jc w:val="both"/>
+        <w:rPr>
+          <w:rFonts w:asciiTheme="minorHAnsi" w:hAnsiTheme="minorHAnsi" w:cs="Calibri"/>
+          <w:sz w:val="21"/>
+          <w:szCs w:val="21"/>
+        </w:rPr>
+      </w:pPr>
+    </w:p>
+    <w:p>
+      <w:pPr>
+        <w:tabs>
+          <w:tab w:val="left" w:pos="284"/>
+          <w:tab w:val="left" w:pos="567"/>
+          <w:tab w:val="left" w:pos="851"/>
+          <w:tab w:val="left" w:pos="1134"/>
+          <w:tab w:val="left" w:pos="1701"/>
+        </w:tabs>
+        <w:spacing w:line="240" w:lineRule="auto"/>
+        <w:contextualSpacing/>
+        <w:jc w:val="both"/>
+        <w:rPr>
+          <w:rFonts w:asciiTheme="minorHAnsi" w:hAnsiTheme="minorHAnsi" w:cs="Calibri"/>
+          <w:sz w:val="21"/>
+          <w:szCs w:val="21"/>
+        </w:rPr>
+      </w:pPr>
+      <w:r>
+        <w:rPr>
+          <w:rFonts w:asciiTheme="minorHAnsi" w:hAnsiTheme="minorHAnsi" w:cs="Calibri"/>
+          <w:sz w:val="21"/>
+          <w:szCs w:val="21"/>
+        </w:rPr>
+        <w:t/>
+      </w:r>
+      <w:r>
+        <w:rPr>
+          <w:rFonts w:asciiTheme="minorHAnsi" w:hAnsiTheme="minorHAnsi" w:cs="Calibri"/>
+          <w:sz w:val="21"/>
+          <w:szCs w:val="21"/>
+        </w:rPr>
+        <w:t xml:space="preserve"/>
       </w:r>
     </w:p>
     <w:p>
@@ -1050,7 +1112,7 @@
 </file>
 
 <file path=word/endnotes.xml><?xml version="1.0" encoding="utf-8"?>
-<w:endnotes xmlns:wpc="http://schemas.microsoft.com/office/word/2010/wordprocessingCanvas" xmlns:cx="http://schemas.microsoft.com/office/drawing/2014/chartex" xmlns:cx1="http://schemas.microsoft.com/office/drawing/2015/9/8/chartex" xmlns:cx2="http://schemas.microsoft.com/office/drawing/2015/10/21/chartex" xmlns:cx3="http://schemas.microsoft.com/office/drawing/2016/5/9/chartex" xmlns:cx4="http://schemas.microsoft.com/office/drawing/2016/5/10/chartex" xmlns:cx5="http://schemas.microsoft.com/office/drawing/2016/5/11/chartex" xmlns:cx6="http://schemas.microsoft.com/office/drawing/2016/5/12/chartex" xmlns:cx7="http://schemas.microsoft.com/office/drawing/2016/5/13/chartex" xmlns:cx8="http://schemas.microsoft.com/office/drawing/2016/5/14/chartex" xmlns:mc="http://schemas.openxmlformats.org/markup-compatibility/2006" xmlns:aink="http://schemas.microsoft.com/office/drawing/2016/ink" xmlns:am3d="http://schemas.microsoft.com/office/drawing/2017/model3d" xmlns:o="urn:schemas-microsoft-com:office:office" xmlns:oel="http://schemas.microsoft.com/office/2019/extlst" xmlns:r="http://schemas.openxmlformats.org/officeDocument/2006/relationships" xmlns:m="http://schemas.openxmlformats.org/officeDocument/2006/math" xmlns:v="urn:schemas-microsoft-com:vml" xmlns:wp14="http://schemas.microsoft.com/office/word/2010/wordprocessingDrawing" xmlns:wp="http://schemas.openxmlformats.org/drawingml/2006/wordprocessingDrawing" xmlns:w10="urn:schemas-microsoft-com:office:word" xmlns:w="http://schemas.openxmlformats.org/wordprocessingml/2006/main" xmlns:w14="http://schemas.microsoft.com/office/word/2010/wordml" xmlns:w15="http://schemas.microsoft.com/office/word/2012/wordml" xmlns:w16cex="http://schemas.microsoft.com/office/word/2018/wordml/cex" xmlns:w16cid="http://schemas.microsoft.com/office/word/2016/wordml/cid" xmlns:w16="http://schemas.microsoft.com/office/word/2018/wordml" xmlns:w16du="http://schemas.microsoft.com/office/word/2023/wordml/word16du" xmlns:w16sdtdh="http://schemas.microsoft.com/office/word/2020/wordml/sdtdatahash" xmlns:w16sdtfl="http://schemas.microsoft.com/office/word/2024/wordml/sdtformatlock" xmlns:w16se="http://schemas.microsoft.com/office/word/2015/wordml/symex" xmlns:wpg="http://schemas.microsoft.com/office/word/2010/wordprocessingGroup" xmlns:wpi="http://schemas.microsoft.com/office/word/2010/wordprocessingInk" xmlns:wne="http://schemas.microsoft.com/office/word/2006/wordml" xmlns:wps="http://schemas.microsoft.com/office/word/2010/wordprocessingShape" mc:Ignorable="w14 w15 w16se w16cid w16 w16cex w16sdtdh w16sdtfl w16du wp14">
+<w:endnotes xmlns:wpc="http://schemas.microsoft.com/office/word/2010/wordprocessingCanvas" xmlns:cx="http://schemas.microsoft.com/office/drawing/2014/chartex" xmlns:cx1="http://schemas.microsoft.com/office/drawing/2015/9/8/chartex" xmlns:cx2="http://schemas.microsoft.com/office/drawing/2015/10/21/chartex" xmlns:cx3="http://schemas.microsoft.com/office/drawing/2016/5/9/chartex" xmlns:cx4="http://schemas.microsoft.com/office/drawing/2016/5/10/chartex" xmlns:cx5="http://schemas.microsoft.com/office/drawing/2016/5/11/chartex" xmlns:cx6="http://schemas.microsoft.com/office/drawing/2016/5/12/chartex" xmlns:cx7="http://schemas.microsoft.com/office/drawing/2016/5/13/chartex" xmlns:cx8="http://schemas.microsoft.com/office/drawing/2016/5/14/chartex" xmlns:mc="http://schemas.openxmlformats.org/markup-compatibility/2006" xmlns:aink="http://schemas.microsoft.com/office/drawing/2016/ink" xmlns:am3d="http://schemas.microsoft.com/office/drawing/2017/model3d" xmlns:o="urn:schemas-microsoft-com:office:office" xmlns:r="http://schemas.openxmlformats.org/officeDocument/2006/relationships" xmlns:m="http://schemas.openxmlformats.org/officeDocument/2006/math" xmlns:v="urn:schemas-microsoft-com:vml" xmlns:wp14="http://schemas.microsoft.com/office/word/2010/wordprocessingDrawing" xmlns:wp="http://schemas.openxmlformats.org/drawingml/2006/wordprocessingDrawing" xmlns:w10="urn:schemas-microsoft-com:office:word" xmlns:w="http://schemas.openxmlformats.org/wordprocessingml/2006/main" xmlns:w14="http://schemas.microsoft.com/office/word/2010/wordml" xmlns:w15="http://schemas.microsoft.com/office/word/2012/wordml" xmlns:w16cex="http://schemas.microsoft.com/office/word/2018/wordml/cex" xmlns:w16cid="http://schemas.microsoft.com/office/word/2016/wordml/cid" xmlns:w16="http://schemas.microsoft.com/office/word/2018/wordml" xmlns:w16sdtdh="http://schemas.microsoft.com/office/word/2020/wordml/sdtdatahash" xmlns:w16se="http://schemas.microsoft.com/office/word/2015/wordml/symex" xmlns:wpg="http://schemas.microsoft.com/office/word/2010/wordprocessingGroup" xmlns:wpi="http://schemas.microsoft.com/office/word/2010/wordprocessingInk" xmlns:wne="http://schemas.microsoft.com/office/word/2006/wordml" xmlns:wps="http://schemas.microsoft.com/office/word/2010/wordprocessingShape" mc:Ignorable="w14 w15 w16se w16cid w16 w16cex w16sdtdh wp14">
   <w:endnote w:type="separator" w:id="-1">
     <w:p>
       <w:pPr>
@@ -1075,7 +1137,7 @@
 </file>
 
 <file path=word/footer1.xml><?xml version="1.0" encoding="utf-8"?>
-<w:ftr xmlns:wpc="http://schemas.microsoft.com/office/word/2010/wordprocessingCanvas" xmlns:cx="http://schemas.microsoft.com/office/drawing/2014/chartex" xmlns:cx1="http://schemas.microsoft.com/office/drawing/2015/9/8/chartex" xmlns:cx2="http://schemas.microsoft.com/office/drawing/2015/10/21/chartex" xmlns:cx3="http://schemas.microsoft.com/office/drawing/2016/5/9/chartex" xmlns:cx4="http://schemas.microsoft.com/office/drawing/2016/5/10/chartex" xmlns:cx5="http://schemas.microsoft.com/office/drawing/2016/5/11/chartex" xmlns:cx6="http://schemas.microsoft.com/office/drawing/2016/5/12/chartex" xmlns:cx7="http://schemas.microsoft.com/office/drawing/2016/5/13/chartex" xmlns:cx8="http://schemas.microsoft.com/office/drawing/2016/5/14/chartex" xmlns:mc="http://schemas.openxmlformats.org/markup-compatibility/2006" xmlns:aink="http://schemas.microsoft.com/office/drawing/2016/ink" xmlns:am3d="http://schemas.microsoft.com/office/drawing/2017/model3d" xmlns:o="urn:schemas-microsoft-com:office:office" xmlns:oel="http://schemas.microsoft.com/office/2019/extlst" xmlns:r="http://schemas.openxmlformats.org/officeDocument/2006/relationships" xmlns:m="http://schemas.openxmlformats.org/officeDocument/2006/math" xmlns:v="urn:schemas-microsoft-com:vml" xmlns:wp14="http://schemas.microsoft.com/office/word/2010/wordprocessingDrawing" xmlns:wp="http://schemas.openxmlformats.org/drawingml/2006/wordprocessingDrawing" xmlns:w10="urn:schemas-microsoft-com:office:word" xmlns:w="http://schemas.openxmlformats.org/wordprocessingml/2006/main" xmlns:w14="http://schemas.microsoft.com/office/word/2010/wordml" xmlns:w15="http://schemas.microsoft.com/office/word/2012/wordml" xmlns:w16cex="http://schemas.microsoft.com/office/word/2018/wordml/cex" xmlns:w16cid="http://schemas.microsoft.com/office/word/2016/wordml/cid" xmlns:w16="http://schemas.microsoft.com/office/word/2018/wordml" xmlns:w16du="http://schemas.microsoft.com/office/word/2023/wordml/word16du" xmlns:w16sdtdh="http://schemas.microsoft.com/office/word/2020/wordml/sdtdatahash" xmlns:w16sdtfl="http://schemas.microsoft.com/office/word/2024/wordml/sdtformatlock" xmlns:w16se="http://schemas.microsoft.com/office/word/2015/wordml/symex" xmlns:wpg="http://schemas.microsoft.com/office/word/2010/wordprocessingGroup" xmlns:wpi="http://schemas.microsoft.com/office/word/2010/wordprocessingInk" xmlns:wne="http://schemas.microsoft.com/office/word/2006/wordml" xmlns:wps="http://schemas.microsoft.com/office/word/2010/wordprocessingShape" mc:Ignorable="w14 w15 w16se w16cid w16 w16cex w16sdtdh w16sdtfl w16du wp14">
+<w:ftr xmlns:wpc="http://schemas.microsoft.com/office/word/2010/wordprocessingCanvas" xmlns:cx="http://schemas.microsoft.com/office/drawing/2014/chartex" xmlns:cx1="http://schemas.microsoft.com/office/drawing/2015/9/8/chartex" xmlns:cx2="http://schemas.microsoft.com/office/drawing/2015/10/21/chartex" xmlns:cx3="http://schemas.microsoft.com/office/drawing/2016/5/9/chartex" xmlns:cx4="http://schemas.microsoft.com/office/drawing/2016/5/10/chartex" xmlns:cx5="http://schemas.microsoft.com/office/drawing/2016/5/11/chartex" xmlns:cx6="http://schemas.microsoft.com/office/drawing/2016/5/12/chartex" xmlns:cx7="http://schemas.microsoft.com/office/drawing/2016/5/13/chartex" xmlns:cx8="http://schemas.microsoft.com/office/drawing/2016/5/14/chartex" xmlns:mc="http://schemas.openxmlformats.org/markup-compatibility/2006" xmlns:aink="http://schemas.microsoft.com/office/drawing/2016/ink" xmlns:am3d="http://schemas.microsoft.com/office/drawing/2017/model3d" xmlns:o="urn:schemas-microsoft-com:office:office" xmlns:r="http://schemas.openxmlformats.org/officeDocument/2006/relationships" xmlns:m="http://schemas.openxmlformats.org/officeDocument/2006/math" xmlns:v="urn:schemas-microsoft-com:vml" xmlns:wp14="http://schemas.microsoft.com/office/word/2010/wordprocessingDrawing" xmlns:wp="http://schemas.openxmlformats.org/drawingml/2006/wordprocessingDrawing" xmlns:w10="urn:schemas-microsoft-com:office:word" xmlns:w="http://schemas.openxmlformats.org/wordprocessingml/2006/main" xmlns:w14="http://schemas.microsoft.com/office/word/2010/wordml" xmlns:w15="http://schemas.microsoft.com/office/word/2012/wordml" xmlns:w16cex="http://schemas.microsoft.com/office/word/2018/wordml/cex" xmlns:w16cid="http://schemas.microsoft.com/office/word/2016/wordml/cid" xmlns:w16="http://schemas.microsoft.com/office/word/2018/wordml" xmlns:w16sdtdh="http://schemas.microsoft.com/office/word/2020/wordml/sdtdatahash" xmlns:w16se="http://schemas.microsoft.com/office/word/2015/wordml/symex" xmlns:wpg="http://schemas.microsoft.com/office/word/2010/wordprocessingGroup" xmlns:wpi="http://schemas.microsoft.com/office/word/2010/wordprocessingInk" xmlns:wne="http://schemas.microsoft.com/office/word/2006/wordml" xmlns:wps="http://schemas.microsoft.com/office/word/2010/wordprocessingShape" mc:Ignorable="w14 w15 w16se w16cid w16 w16cex w16sdtdh wp14">
   <w:p>
     <w:pPr>
       <w:pStyle w:val="Footer"/>
@@ -1098,7 +1160,7 @@
         <w:sz w:val="16"/>
         <w:szCs w:val="16"/>
       </w:rPr>
-      <w:t>Yvonne BROWN</w:t>
+      <w:t>{patientName}</w:t>
     </w:r>
     <w:r>
       <w:rPr>
@@ -1212,7 +1274,7 @@
 </file>
 
 <file path=word/footnotes.xml><?xml version="1.0" encoding="utf-8"?>
-<w:footnotes xmlns:wpc="http://schemas.microsoft.com/office/word/2010/wordprocessingCanvas" xmlns:cx="http://schemas.microsoft.com/office/drawing/2014/chartex" xmlns:cx1="http://schemas.microsoft.com/office/drawing/2015/9/8/chartex" xmlns:cx2="http://schemas.microsoft.com/office/drawing/2015/10/21/chartex" xmlns:cx3="http://schemas.microsoft.com/office/drawing/2016/5/9/chartex" xmlns:cx4="http://schemas.microsoft.com/office/drawing/2016/5/10/chartex" xmlns:cx5="http://schemas.microsoft.com/office/drawing/2016/5/11/chartex" xmlns:cx6="http://schemas.microsoft.com/office/drawing/2016/5/12/chartex" xmlns:cx7="http://schemas.microsoft.com/office/drawing/2016/5/13/chartex" xmlns:cx8="http://schemas.microsoft.com/office/drawing/2016/5/14/chartex" xmlns:mc="http://schemas.openxmlformats.org/markup-compatibility/2006" xmlns:aink="http://schemas.microsoft.com/office/drawing/2016/ink" xmlns:am3d="http://schemas.microsoft.com/office/drawing/2017/model3d" xmlns:o="urn:schemas-microsoft-com:office:office" xmlns:oel="http://schemas.microsoft.com/office/2019/extlst" xmlns:r="http://schemas.openxmlformats.org/officeDocument/2006/relationships" xmlns:m="http://schemas.openxmlformats.org/officeDocument/2006/math" xmlns:v="urn:schemas-microsoft-com:vml" xmlns:wp14="http://schemas.microsoft.com/office/word/2010/wordprocessingDrawing" xmlns:wp="http://schemas.openxmlformats.org/drawingml/2006/wordprocessingDrawing" xmlns:w10="urn:schemas-microsoft-com:office:word" xmlns:w="http://schemas.openxmlformats.org/wordprocessingml/2006/main" xmlns:w14="http://schemas.microsoft.com/office/word/2010/wordml" xmlns:w15="http://schemas.microsoft.com/office/word/2012/wordml" xmlns:w16cex="http://schemas.microsoft.com/office/word/2018/wordml/cex" xmlns:w16cid="http://schemas.microsoft.com/office/word/2016/wordml/cid" xmlns:w16="http://schemas.microsoft.com/office/word/2018/wordml" xmlns:w16du="http://schemas.microsoft.com/office/word/2023/wordml/word16du" xmlns:w16sdtdh="http://schemas.microsoft.com/office/word/2020/wordml/sdtdatahash" xmlns:w16sdtfl="http://schemas.microsoft.com/office/word/2024/wordml/sdtformatlock" xmlns:w16se="http://schemas.microsoft.com/office/word/2015/wordml/symex" xmlns:wpg="http://schemas.microsoft.com/office/word/2010/wordprocessingGroup" xmlns:wpi="http://schemas.microsoft.com/office/word/2010/wordprocessingInk" xmlns:wne="http://schemas.microsoft.com/office/word/2006/wordml" xmlns:wps="http://schemas.microsoft.com/office/word/2010/wordprocessingShape" mc:Ignorable="w14 w15 w16se w16cid w16 w16cex w16sdtdh w16sdtfl w16du wp14">
+<w:footnotes xmlns:wpc="http://schemas.microsoft.com/office/word/2010/wordprocessingCanvas" xmlns:cx="http://schemas.microsoft.com/office/drawing/2014/chartex" xmlns:cx1="http://schemas.microsoft.com/office/drawing/2015/9/8/chartex" xmlns:cx2="http://schemas.microsoft.com/office/drawing/2015/10/21/chartex" xmlns:cx3="http://schemas.microsoft.com/office/drawing/2016/5/9/chartex" xmlns:cx4="http://schemas.microsoft.com/office/drawing/2016/5/10/chartex" xmlns:cx5="http://schemas.microsoft.com/office/drawing/2016/5/11/chartex" xmlns:cx6="http://schemas.microsoft.com/office/drawing/2016/5/12/chartex" xmlns:cx7="http://schemas.microsoft.com/office/drawing/2016/5/13/chartex" xmlns:cx8="http://schemas.microsoft.com/office/drawing/2016/5/14/chartex" xmlns:mc="http://schemas.openxmlformats.org/markup-compatibility/2006" xmlns:aink="http://schemas.microsoft.com/office/drawing/2016/ink" xmlns:am3d="http://schemas.microsoft.com/office/drawing/2017/model3d" xmlns:o="urn:schemas-microsoft-com:office:office" xmlns:r="http://schemas.openxmlformats.org/officeDocument/2006/relationships" xmlns:m="http://schemas.openxmlformats.org/officeDocument/2006/math" xmlns:v="urn:schemas-microsoft-com:vml" xmlns:wp14="http://schemas.microsoft.com/office/word/2010/wordprocessingDrawing" xmlns:wp="http://schemas.openxmlformats.org/drawingml/2006/wordprocessingDrawing" xmlns:w10="urn:schemas-microsoft-com:office:word" xmlns:w="http://schemas.openxmlformats.org/wordprocessingml/2006/main" xmlns:w14="http://schemas.microsoft.com/office/word/2010/wordml" xmlns:w15="http://schemas.microsoft.com/office/word/2012/wordml" xmlns:w16cex="http://schemas.microsoft.com/office/word/2018/wordml/cex" xmlns:w16cid="http://schemas.microsoft.com/office/word/2016/wordml/cid" xmlns:w16="http://schemas.microsoft.com/office/word/2018/wordml" xmlns:w16sdtdh="http://schemas.microsoft.com/office/word/2020/wordml/sdtdatahash" xmlns:w16se="http://schemas.microsoft.com/office/word/2015/wordml/symex" xmlns:wpg="http://schemas.microsoft.com/office/word/2010/wordprocessingGroup" xmlns:wpi="http://schemas.microsoft.com/office/word/2010/wordprocessingInk" xmlns:wne="http://schemas.microsoft.com/office/word/2006/wordml" xmlns:wps="http://schemas.microsoft.com/office/word/2010/wordprocessingShape" mc:Ignorable="w14 w15 w16se w16cid w16 w16cex w16sdtdh wp14">
   <w:footnote w:type="separator" w:id="-1">
     <w:p>
       <w:pPr>
@@ -1237,7 +1299,7 @@
 </file>
 
 <file path=word/header1.xml><?xml version="1.0" encoding="utf-8"?>
-<w:hdr xmlns:wpc="http://schemas.microsoft.com/office/word/2010/wordprocessingCanvas" xmlns:cx="http://schemas.microsoft.com/office/drawing/2014/chartex" xmlns:cx1="http://schemas.microsoft.com/office/drawing/2015/9/8/chartex" xmlns:cx2="http://schemas.microsoft.com/office/drawing/2015/10/21/chartex" xmlns:cx3="http://schemas.microsoft.com/office/drawing/2016/5/9/chartex" xmlns:cx4="http://schemas.microsoft.com/office/drawing/2016/5/10/chartex" xmlns:cx5="http://schemas.microsoft.com/office/drawing/2016/5/11/chartex" xmlns:cx6="http://schemas.microsoft.com/office/drawing/2016/5/12/chartex" xmlns:cx7="http://schemas.microsoft.com/office/drawing/2016/5/13/chartex" xmlns:cx8="http://schemas.microsoft.com/office/drawing/2016/5/14/chartex" xmlns:mc="http://schemas.openxmlformats.org/markup-compatibility/2006" xmlns:aink="http://schemas.microsoft.com/office/drawing/2016/ink" xmlns:am3d="http://schemas.microsoft.com/office/drawing/2017/model3d" xmlns:o="urn:schemas-microsoft-com:office:office" xmlns:oel="http://schemas.microsoft.com/office/2019/extlst" xmlns:r="http://schemas.openxmlformats.org/officeDocument/2006/relationships" xmlns:m="http://schemas.openxmlformats.org/officeDocument/2006/math" xmlns:v="urn:schemas-microsoft-com:vml" xmlns:wp14="http://schemas.microsoft.com/office/word/2010/wordprocessingDrawing" xmlns:wp="http://schemas.openxmlformats.org/drawingml/2006/wordprocessingDrawing" xmlns:w10="urn:schemas-microsoft-com:office:word" xmlns:w="http://schemas.openxmlformats.org/wordprocessingml/2006/main" xmlns:w14="http://schemas.microsoft.com/office/word/2010/wordml" xmlns:w15="http://schemas.microsoft.com/office/word/2012/wordml" xmlns:w16cex="http://schemas.microsoft.com/office/word/2018/wordml/cex" xmlns:w16cid="http://schemas.microsoft.com/office/word/2016/wordml/cid" xmlns:w16="http://schemas.microsoft.com/office/word/2018/wordml" xmlns:w16du="http://schemas.microsoft.com/office/word/2023/wordml/word16du" xmlns:w16sdtdh="http://schemas.microsoft.com/office/word/2020/wordml/sdtdatahash" xmlns:w16sdtfl="http://schemas.microsoft.com/office/word/2024/wordml/sdtformatlock" xmlns:w16se="http://schemas.microsoft.com/office/word/2015/wordml/symex" xmlns:wpg="http://schemas.microsoft.com/office/word/2010/wordprocessingGroup" xmlns:wpi="http://schemas.microsoft.com/office/word/2010/wordprocessingInk" xmlns:wne="http://schemas.microsoft.com/office/word/2006/wordml" xmlns:wps="http://schemas.microsoft.com/office/word/2010/wordprocessingShape" mc:Ignorable="w14 w15 w16se w16cid w16 w16cex w16sdtdh w16sdtfl w16du wp14">
+<w:hdr xmlns:wpc="http://schemas.microsoft.com/office/word/2010/wordprocessingCanvas" xmlns:cx="http://schemas.microsoft.com/office/drawing/2014/chartex" xmlns:cx1="http://schemas.microsoft.com/office/drawing/2015/9/8/chartex" xmlns:cx2="http://schemas.microsoft.com/office/drawing/2015/10/21/chartex" xmlns:cx3="http://schemas.microsoft.com/office/drawing/2016/5/9/chartex" xmlns:cx4="http://schemas.microsoft.com/office/drawing/2016/5/10/chartex" xmlns:cx5="http://schemas.microsoft.com/office/drawing/2016/5/11/chartex" xmlns:cx6="http://schemas.microsoft.com/office/drawing/2016/5/12/chartex" xmlns:cx7="http://schemas.microsoft.com/office/drawing/2016/5/13/chartex" xmlns:cx8="http://schemas.microsoft.com/office/drawing/2016/5/14/chartex" xmlns:mc="http://schemas.openxmlformats.org/markup-compatibility/2006" xmlns:aink="http://schemas.microsoft.com/office/drawing/2016/ink" xmlns:am3d="http://schemas.microsoft.com/office/drawing/2017/model3d" xmlns:o="urn:schemas-microsoft-com:office:office" xmlns:r="http://schemas.openxmlformats.org/officeDocument/2006/relationships" xmlns:m="http://schemas.openxmlformats.org/officeDocument/2006/math" xmlns:v="urn:schemas-microsoft-com:vml" xmlns:wp14="http://schemas.microsoft.com/office/word/2010/wordprocessingDrawing" xmlns:wp="http://schemas.openxmlformats.org/drawingml/2006/wordprocessingDrawing" xmlns:w10="urn:schemas-microsoft-com:office:word" xmlns:w="http://schemas.openxmlformats.org/wordprocessingml/2006/main" xmlns:w14="http://schemas.microsoft.com/office/word/2010/wordml" xmlns:w15="http://schemas.microsoft.com/office/word/2012/wordml" xmlns:w16cex="http://schemas.microsoft.com/office/word/2018/wordml/cex" xmlns:w16cid="http://schemas.microsoft.com/office/word/2016/wordml/cid" xmlns:w16="http://schemas.microsoft.com/office/word/2018/wordml" xmlns:w16sdtdh="http://schemas.microsoft.com/office/word/2020/wordml/sdtdatahash" xmlns:w16se="http://schemas.microsoft.com/office/word/2015/wordml/symex" xmlns:wpg="http://schemas.microsoft.com/office/word/2010/wordprocessingGroup" xmlns:wpi="http://schemas.microsoft.com/office/word/2010/wordprocessingInk" xmlns:wne="http://schemas.microsoft.com/office/word/2006/wordml" xmlns:wps="http://schemas.microsoft.com/office/word/2010/wordprocessingShape" mc:Ignorable="w14 w15 w16se w16cid w16 w16cex w16sdtdh wp14">
   <w:p>
     <w:pPr>
       <w:jc w:val="center"/>
@@ -1249,6 +1311,7 @@
         <w:szCs w:val="36"/>
       </w:rPr>
     </w:pPr>
+    <w:proofErr w:type="spellStart"/>
     <w:r>
       <w:rPr>
         <w:rFonts w:asciiTheme="majorHAnsi" w:hAnsiTheme="majorHAnsi"/>
@@ -1257,7 +1320,18 @@
         <w:sz w:val="36"/>
         <w:szCs w:val="36"/>
       </w:rPr>
-      <w:t>Dr. Senthuran Shivakumar</w:t>
+      <w:t>Dr.</w:t>
+    </w:r>
+    <w:proofErr w:type="spellEnd"/>
+    <w:r>
+      <w:rPr>
+        <w:rFonts w:asciiTheme="majorHAnsi" w:hAnsiTheme="majorHAnsi"/>
+        <w:b/>
+        <w:color w:val="351C75"/>
+        <w:sz w:val="36"/>
+        <w:szCs w:val="36"/>
+      </w:rPr>
+      <w:t xml:space="preserve"> Senthuran Shivakumar</w:t>
     </w:r>
   </w:p>
   <w:p>
@@ -1312,7 +1386,7 @@
 </file>
 
 <file path=word/styles.xml><?xml version="1.0" encoding="utf-8"?>
-<w:styles xmlns:mc="http://schemas.openxmlformats.org/markup-compatibility/2006" xmlns:r="http://schemas.openxmlformats.org/officeDocument/2006/relationships" xmlns:w="http://schemas.openxmlformats.org/wordprocessingml/2006/main" xmlns:w14="http://schemas.microsoft.com/office/word/2010/wordml" xmlns:w15="http://schemas.microsoft.com/office/word/2012/wordml" xmlns:w16cex="http://schemas.microsoft.com/office/word/2018/wordml/cex" xmlns:w16cid="http://schemas.microsoft.com/office/word/2016/wordml/cid" xmlns:w16="http://schemas.microsoft.com/office/word/2018/wordml" xmlns:w16du="http://schemas.microsoft.com/office/word/2023/wordml/word16du" xmlns:w16sdtdh="http://schemas.microsoft.com/office/word/2020/wordml/sdtdatahash" xmlns:w16sdtfl="http://schemas.microsoft.com/office/word/2024/wordml/sdtformatlock" xmlns:w16se="http://schemas.microsoft.com/office/word/2015/wordml/symex" mc:Ignorable="w14 w15 w16se w16cid w16 w16cex w16sdtdh w16sdtfl w16du">
+<w:styles xmlns:mc="http://schemas.openxmlformats.org/markup-compatibility/2006" xmlns:r="http://schemas.openxmlformats.org/officeDocument/2006/relationships" xmlns:w="http://schemas.openxmlformats.org/wordprocessingml/2006/main" xmlns:w14="http://schemas.microsoft.com/office/word/2010/wordml" xmlns:w15="http://schemas.microsoft.com/office/word/2012/wordml" xmlns:w16cex="http://schemas.microsoft.com/office/word/2018/wordml/cex" xmlns:w16cid="http://schemas.microsoft.com/office/word/2016/wordml/cid" xmlns:w16="http://schemas.microsoft.com/office/word/2018/wordml" xmlns:w16sdtdh="http://schemas.microsoft.com/office/word/2020/wordml/sdtdatahash" xmlns:w16se="http://schemas.microsoft.com/office/word/2015/wordml/symex" mc:Ignorable="w14 w15 w16se w16cid w16 w16cex w16sdtdh">
   <w:docDefaults>
     <w:rPrDefault>
       <w:rPr>
@@ -1721,6 +1795,7 @@
   <w:style w:type="character" w:default="1" w:styleId="DefaultParagraphFont">
     <w:name w:val="Default Paragraph Font"/>
     <w:uiPriority w:val="1"/>
+    <w:semiHidden/>
     <w:unhideWhenUsed/>
   </w:style>
   <w:style w:type="table" w:default="1" w:styleId="TableNormal">
@@ -1833,19 +1908,6 @@
       <w:rFonts w:cs="Times New Roman"/>
       <w:color w:val="0563C1" w:themeColor="hyperlink"/>
       <w:u w:val="single"/>
-    </w:rPr>
-  </w:style>
-  <w:style w:type="paragraph" w:styleId="NormalWeb">
-    <w:name w:val="Normal (Web)"/>
-    <w:basedOn w:val="Normal"/>
-    <w:uiPriority w:val="99"/>
-    <w:semiHidden/>
-    <w:unhideWhenUsed/>
-    <w:rsid w:val="00604D41"/>
-    <w:rPr>
-      <w:rFonts w:ascii="Times New Roman" w:hAnsi="Times New Roman"/>
-      <w:sz w:val="24"/>
-      <w:szCs w:val="24"/>
     </w:rPr>
   </w:style>
 </w:styles>

</xml_diff>